<commit_message>
Add scoring guide and worked example to Trustworthiness, Relevance and Personalization
</commit_message>
<xml_diff>
--- a/docs/rubric/[updated] Clinician Evaluation Rubric.docx
+++ b/docs/rubric/[updated] Clinician Evaluation Rubric.docx
@@ -1722,6 +1722,22 @@
         <w:t xml:space="preserve">. Judge the fit between the two: a firm claim on strong evidence and a hedged claim on weak evidence both score well; overstating a thin case or hedging a clear one both score poorly. Score the fit, not whether you agree with the conclusions.</w:t>
       </w:r>
     </w:p>
+    <w:p>
+      <w:pPr>
+        <w:spacing w:after="240" w:before="240" w:line="276" w:lineRule="auto"/>
+        <w:ind w:left="0" w:right="600" w:firstLine="0"/>
+        <w:rPr/>
+      </w:pPr>
+      <w:r>
+        <w:rPr>
+          <w:b w:val="1"/>
+          <w:bCs w:val="1"/>
+          <w:i/>
+          <w:rtl w:val="0"/>
+        </w:rPr>
+        <w:t>Example: a response opens "the thing to take most seriously is circulatory risk" and the Sleep panel shows severe obstructive sleep apnea, so the firm claim is earned — Very Trustworthy (5). Another opens just as firmly but attributes it to hypertension and kidney disease that are nowhere in the Prior medical history panel, so full confidence rests on nothing — Very Untrustworthy (1).</w:t>
+      </w:r>
+    </w:p>
     <w:tbl>
       <w:tblPr>
         <w:tblStyle w:val="Table3"/>
@@ -2395,6 +2411,52 @@
           <w:rtl w:val="0"/>
         </w:rPr>
         <w:t xml:space="preserve"> How effectively does MODEL {A/B/C} RESPONSE identify and prioritize the most clinically relevant indicators?</w:t>
+      </w:r>
+    </w:p>
+    <w:p>
+      <w:pPr>
+        <w:spacing w:after="240" w:before="240" w:line="276" w:lineRule="auto"/>
+        <w:rPr>
+          <w:b w:val="1"/>
+          <w:bCs w:val="1"/>
+        </w:rPr>
+      </w:pPr>
+      <w:r>
+        <w:rPr>
+          <w:b w:val="1"/>
+          <w:bCs w:val="1"/>
+          <w:rtl w:val="0"/>
+        </w:rPr>
+        <w:t>How to score it:</w:t>
+      </w:r>
+    </w:p>
+    <w:p>
+      <w:pPr>
+        <w:spacing w:after="240" w:before="240" w:line="276" w:lineRule="auto"/>
+        <w:ind w:left="0" w:right="600" w:firstLine="0"/>
+        <w:rPr/>
+      </w:pPr>
+      <w:r>
+        <w:rPr>
+          <w:rtl w:val="0"/>
+        </w:rPr>
+        <w:t>Read the response against what the patient asked, shown in the Patient Query. Judge focus and proportion: how much of the letter earns its place, and how much is filler or tangent. This is about dilution, not correctness — a response can be wrong yet focused, or right yet padded, and being wrong is scored under Factuality.</w:t>
+      </w:r>
+    </w:p>
+    <w:p>
+      <w:pPr>
+        <w:spacing w:after="240" w:before="240" w:line="276" w:lineRule="auto"/>
+        <w:ind w:left="0" w:right="600" w:firstLine="0"/>
+        <w:rPr/>
+      </w:pPr>
+      <w:r>
+        <w:rPr>
+          <w:b w:val="1"/>
+          <w:bCs w:val="1"/>
+          <w:i/>
+          <w:rtl w:val="0"/>
+        </w:rPr>
+        <w:t>Example: a response answers the question in a few lines built on the findings that matter and adds nothing else — Very Relevant (5). Another names the right issue but spends much of the letter on a long recital of history and secondary detail that buries it — Irrelevant (2).</w:t>
       </w:r>
     </w:p>
     <w:tbl>
@@ -3084,6 +3146,52 @@
           <w:rtl w:val="0"/>
         </w:rPr>
         <w:t xml:space="preserve">To what extent does MODEL {A/B/C} RESPONSE personalize its synthesis of different health aspects (e.g., lifestyle, cardiovascular)?</w:t>
+      </w:r>
+    </w:p>
+    <w:p>
+      <w:pPr>
+        <w:spacing w:after="240" w:before="240" w:line="276" w:lineRule="auto"/>
+        <w:rPr>
+          <w:b w:val="1"/>
+          <w:bCs w:val="1"/>
+        </w:rPr>
+      </w:pPr>
+      <w:r>
+        <w:rPr>
+          <w:b w:val="1"/>
+          <w:bCs w:val="1"/>
+          <w:rtl w:val="0"/>
+        </w:rPr>
+        <w:t>How to score it:</w:t>
+      </w:r>
+    </w:p>
+    <w:p>
+      <w:pPr>
+        <w:spacing w:after="240" w:before="240" w:line="276" w:lineRule="auto"/>
+        <w:ind w:left="0" w:right="600" w:firstLine="0"/>
+        <w:rPr/>
+      </w:pPr>
+      <w:r>
+        <w:rPr>
+          <w:rtl w:val="0"/>
+        </w:rPr>
+        <w:t>Check how much of this particular patient is in the letter: whether it draws on the Sleep panel, Prior medical history and demographics together, or could have been sent to anyone with similar numbers. Judge how tailored the synthesis reads, not whether its claims are right — that is Factuality.</w:t>
+      </w:r>
+    </w:p>
+    <w:p>
+      <w:pPr>
+        <w:spacing w:after="240" w:before="240" w:line="276" w:lineRule="auto"/>
+        <w:ind w:left="0" w:right="600" w:firstLine="0"/>
+        <w:rPr/>
+      </w:pPr>
+      <w:r>
+        <w:rPr>
+          <w:b w:val="1"/>
+          <w:bCs w:val="1"/>
+          <w:i/>
+          <w:rtl w:val="0"/>
+        </w:rPr>
+        <w:t>Example: a response ties the patient's own sleep measurements to their age, tobacco use and lipid history in one connected picture that would not fit another patient — Highly Personalized (5). Another quotes a couple of indices and their age, then gives advice that would suit anyone with those numbers — Generic (2).</w:t>
       </w:r>
     </w:p>
     <w:tbl>

</xml_diff>